<commit_message>
finis add trd automation
</commit_message>
<xml_diff>
--- a/docs/pia/pia_generated.docx
+++ b/docs/pia/pia_generated.docx
@@ -12973,7 +12973,107 @@
                 <w:szCs w:val="20"/>
                 <w:lang w:val="en-ID"/>
               </w:rPr>
-              <w:t>  "download": "value",</w:t>
+              <w:t>  "download": {</w:t>
+            </w:r>
+          </w:p>
+          <w:p>
+            <w:pPr>
+              <w:spacing w:line="240" w:lineRule="auto"/>
+              <w:rPr>
+                <w:rFonts w:ascii="Courier New" w:eastAsia="Courier New" w:hAnsi="Courier New" w:cs="Courier New"/>
+                <w:sz w:val="20"/>
+                <w:szCs w:val="20"/>
+                <w:lang w:val="en-ID"/>
+              </w:rPr>
+            </w:pPr>
+            <w:r>
+              <w:rPr>
+                <w:rFonts w:ascii="Courier New" w:eastAsia="Courier New" w:hAnsi="Courier New" w:cs="Courier New"/>
+                <w:sz w:val="20"/>
+                <w:szCs w:val="20"/>
+                <w:lang w:val="en-ID"/>
+              </w:rPr>
+              <w:t>  "is_download": true,</w:t>
+            </w:r>
+          </w:p>
+          <w:p>
+            <w:pPr>
+              <w:spacing w:line="240" w:lineRule="auto"/>
+              <w:rPr>
+                <w:rFonts w:ascii="Courier New" w:eastAsia="Courier New" w:hAnsi="Courier New" w:cs="Courier New"/>
+                <w:sz w:val="20"/>
+                <w:szCs w:val="20"/>
+                <w:lang w:val="en-ID"/>
+              </w:rPr>
+            </w:pPr>
+            <w:r>
+              <w:rPr>
+                <w:rFonts w:ascii="Courier New" w:eastAsia="Courier New" w:hAnsi="Courier New" w:cs="Courier New"/>
+                <w:sz w:val="20"/>
+                <w:szCs w:val="20"/>
+                <w:lang w:val="en-ID"/>
+              </w:rPr>
+              <w:t>  "range_end": 0,</w:t>
+            </w:r>
+          </w:p>
+          <w:p>
+            <w:pPr>
+              <w:spacing w:line="240" w:lineRule="auto"/>
+              <w:rPr>
+                <w:rFonts w:ascii="Courier New" w:eastAsia="Courier New" w:hAnsi="Courier New" w:cs="Courier New"/>
+                <w:sz w:val="20"/>
+                <w:szCs w:val="20"/>
+                <w:lang w:val="en-ID"/>
+              </w:rPr>
+            </w:pPr>
+            <w:r>
+              <w:rPr>
+                <w:rFonts w:ascii="Courier New" w:eastAsia="Courier New" w:hAnsi="Courier New" w:cs="Courier New"/>
+                <w:sz w:val="20"/>
+                <w:szCs w:val="20"/>
+                <w:lang w:val="en-ID"/>
+              </w:rPr>
+              <w:t>  "range_start": 0,</w:t>
+            </w:r>
+          </w:p>
+          <w:p>
+            <w:pPr>
+              <w:spacing w:line="240" w:lineRule="auto"/>
+              <w:rPr>
+                <w:rFonts w:ascii="Courier New" w:eastAsia="Courier New" w:hAnsi="Courier New" w:cs="Courier New"/>
+                <w:sz w:val="20"/>
+                <w:szCs w:val="20"/>
+                <w:lang w:val="en-ID"/>
+              </w:rPr>
+            </w:pPr>
+            <w:r>
+              <w:rPr>
+                <w:rFonts w:ascii="Courier New" w:eastAsia="Courier New" w:hAnsi="Courier New" w:cs="Courier New"/>
+                <w:sz w:val="20"/>
+                <w:szCs w:val="20"/>
+                <w:lang w:val="en-ID"/>
+              </w:rPr>
+              <w:t>  "type": "string"</w:t>
+            </w:r>
+          </w:p>
+          <w:p>
+            <w:pPr>
+              <w:spacing w:line="240" w:lineRule="auto"/>
+              <w:rPr>
+                <w:rFonts w:ascii="Courier New" w:eastAsia="Courier New" w:hAnsi="Courier New" w:cs="Courier New"/>
+                <w:sz w:val="20"/>
+                <w:szCs w:val="20"/>
+                <w:lang w:val="en-ID"/>
+              </w:rPr>
+            </w:pPr>
+            <w:r>
+              <w:rPr>
+                <w:rFonts w:ascii="Courier New" w:eastAsia="Courier New" w:hAnsi="Courier New" w:cs="Courier New"/>
+                <w:sz w:val="20"/>
+                <w:szCs w:val="20"/>
+                <w:lang w:val="en-ID"/>
+              </w:rPr>
+              <w:t>},</w:t>
             </w:r>
           </w:p>
           <w:p>
@@ -13073,7 +13173,67 @@
                 <w:szCs w:val="20"/>
                 <w:lang w:val="en-ID"/>
               </w:rPr>
-              <w:t>  "sort": "value"</w:t>
+              <w:t>  "sort": {</w:t>
+            </w:r>
+          </w:p>
+          <w:p>
+            <w:pPr>
+              <w:spacing w:line="240" w:lineRule="auto"/>
+              <w:rPr>
+                <w:rFonts w:ascii="Courier New" w:eastAsia="Courier New" w:hAnsi="Courier New" w:cs="Courier New"/>
+                <w:sz w:val="20"/>
+                <w:szCs w:val="20"/>
+                <w:lang w:val="en-ID"/>
+              </w:rPr>
+            </w:pPr>
+            <w:r>
+              <w:rPr>
+                <w:rFonts w:ascii="Courier New" w:eastAsia="Courier New" w:hAnsi="Courier New" w:cs="Courier New"/>
+                <w:sz w:val="20"/>
+                <w:szCs w:val="20"/>
+                <w:lang w:val="en-ID"/>
+              </w:rPr>
+              <w:t>  "by": "string",</w:t>
+            </w:r>
+          </w:p>
+          <w:p>
+            <w:pPr>
+              <w:spacing w:line="240" w:lineRule="auto"/>
+              <w:rPr>
+                <w:rFonts w:ascii="Courier New" w:eastAsia="Courier New" w:hAnsi="Courier New" w:cs="Courier New"/>
+                <w:sz w:val="20"/>
+                <w:szCs w:val="20"/>
+                <w:lang w:val="en-ID"/>
+              </w:rPr>
+            </w:pPr>
+            <w:r>
+              <w:rPr>
+                <w:rFonts w:ascii="Courier New" w:eastAsia="Courier New" w:hAnsi="Courier New" w:cs="Courier New"/>
+                <w:sz w:val="20"/>
+                <w:szCs w:val="20"/>
+                <w:lang w:val="en-ID"/>
+              </w:rPr>
+              <w:t>  "order": "string"</w:t>
+            </w:r>
+          </w:p>
+          <w:p>
+            <w:pPr>
+              <w:spacing w:line="240" w:lineRule="auto"/>
+              <w:rPr>
+                <w:rFonts w:ascii="Courier New" w:eastAsia="Courier New" w:hAnsi="Courier New" w:cs="Courier New"/>
+                <w:sz w:val="20"/>
+                <w:szCs w:val="20"/>
+                <w:lang w:val="en-ID"/>
+              </w:rPr>
+            </w:pPr>
+            <w:r>
+              <w:rPr>
+                <w:rFonts w:ascii="Courier New" w:eastAsia="Courier New" w:hAnsi="Courier New" w:cs="Courier New"/>
+                <w:sz w:val="20"/>
+                <w:szCs w:val="20"/>
+                <w:lang w:val="en-ID"/>
+              </w:rPr>
+              <w:t>}</w:t>
             </w:r>
           </w:p>
           <w:p>
@@ -17645,7 +17805,567 @@
                 <w:szCs w:val="20"/>
                 <w:lang w:val="en-ID"/>
               </w:rPr>
-              <w:t>  "details": [],</w:t>
+              <w:t>  "details": [</w:t>
+            </w:r>
+          </w:p>
+          <w:p>
+            <w:pPr>
+              <w:spacing w:line="240" w:lineRule="auto"/>
+              <w:rPr>
+                <w:rFonts w:ascii="Courier New" w:eastAsia="Courier New" w:hAnsi="Courier New" w:cs="Courier New"/>
+                <w:sz w:val="20"/>
+                <w:szCs w:val="20"/>
+                <w:lang w:val="en-ID"/>
+              </w:rPr>
+            </w:pPr>
+            <w:r>
+              <w:rPr>
+                <w:rFonts w:ascii="Courier New" w:eastAsia="Courier New" w:hAnsi="Courier New" w:cs="Courier New"/>
+                <w:sz w:val="20"/>
+                <w:szCs w:val="20"/>
+                <w:lang w:val="en-ID"/>
+              </w:rPr>
+              <w:t>  {</w:t>
+            </w:r>
+          </w:p>
+          <w:p>
+            <w:pPr>
+              <w:spacing w:line="240" w:lineRule="auto"/>
+              <w:rPr>
+                <w:rFonts w:ascii="Courier New" w:eastAsia="Courier New" w:hAnsi="Courier New" w:cs="Courier New"/>
+                <w:sz w:val="20"/>
+                <w:szCs w:val="20"/>
+                <w:lang w:val="en-ID"/>
+              </w:rPr>
+            </w:pPr>
+            <w:r>
+              <w:rPr>
+                <w:rFonts w:ascii="Courier New" w:eastAsia="Courier New" w:hAnsi="Courier New" w:cs="Courier New"/>
+                <w:sz w:val="20"/>
+                <w:szCs w:val="20"/>
+                <w:lang w:val="en-ID"/>
+              </w:rPr>
+              <w:t>    "branch_code": 0,</w:t>
+            </w:r>
+          </w:p>
+          <w:p>
+            <w:pPr>
+              <w:spacing w:line="240" w:lineRule="auto"/>
+              <w:rPr>
+                <w:rFonts w:ascii="Courier New" w:eastAsia="Courier New" w:hAnsi="Courier New" w:cs="Courier New"/>
+                <w:sz w:val="20"/>
+                <w:szCs w:val="20"/>
+                <w:lang w:val="en-ID"/>
+              </w:rPr>
+            </w:pPr>
+            <w:r>
+              <w:rPr>
+                <w:rFonts w:ascii="Courier New" w:eastAsia="Courier New" w:hAnsi="Courier New" w:cs="Courier New"/>
+                <w:sz w:val="20"/>
+                <w:szCs w:val="20"/>
+                <w:lang w:val="en-ID"/>
+              </w:rPr>
+              <w:t>    "creation_by": "string",</w:t>
+            </w:r>
+          </w:p>
+          <w:p>
+            <w:pPr>
+              <w:spacing w:line="240" w:lineRule="auto"/>
+              <w:rPr>
+                <w:rFonts w:ascii="Courier New" w:eastAsia="Courier New" w:hAnsi="Courier New" w:cs="Courier New"/>
+                <w:sz w:val="20"/>
+                <w:szCs w:val="20"/>
+                <w:lang w:val="en-ID"/>
+              </w:rPr>
+            </w:pPr>
+            <w:r>
+              <w:rPr>
+                <w:rFonts w:ascii="Courier New" w:eastAsia="Courier New" w:hAnsi="Courier New" w:cs="Courier New"/>
+                <w:sz w:val="20"/>
+                <w:szCs w:val="20"/>
+                <w:lang w:val="en-ID"/>
+              </w:rPr>
+              <w:t>    "creation_date": "string",</w:t>
+            </w:r>
+          </w:p>
+          <w:p>
+            <w:pPr>
+              <w:spacing w:line="240" w:lineRule="auto"/>
+              <w:rPr>
+                <w:rFonts w:ascii="Courier New" w:eastAsia="Courier New" w:hAnsi="Courier New" w:cs="Courier New"/>
+                <w:sz w:val="20"/>
+                <w:szCs w:val="20"/>
+                <w:lang w:val="en-ID"/>
+              </w:rPr>
+            </w:pPr>
+            <w:r>
+              <w:rPr>
+                <w:rFonts w:ascii="Courier New" w:eastAsia="Courier New" w:hAnsi="Courier New" w:cs="Courier New"/>
+                <w:sz w:val="20"/>
+                <w:szCs w:val="20"/>
+                <w:lang w:val="en-ID"/>
+              </w:rPr>
+              <w:t>    "id": 0,</w:t>
+            </w:r>
+          </w:p>
+          <w:p>
+            <w:pPr>
+              <w:spacing w:line="240" w:lineRule="auto"/>
+              <w:rPr>
+                <w:rFonts w:ascii="Courier New" w:eastAsia="Courier New" w:hAnsi="Courier New" w:cs="Courier New"/>
+                <w:sz w:val="20"/>
+                <w:szCs w:val="20"/>
+                <w:lang w:val="en-ID"/>
+              </w:rPr>
+            </w:pPr>
+            <w:r>
+              <w:rPr>
+                <w:rFonts w:ascii="Courier New" w:eastAsia="Courier New" w:hAnsi="Courier New" w:cs="Courier New"/>
+                <w:sz w:val="20"/>
+                <w:szCs w:val="20"/>
+                <w:lang w:val="en-ID"/>
+              </w:rPr>
+              <w:t>    "id_ref_file": "string",</w:t>
+            </w:r>
+          </w:p>
+          <w:p>
+            <w:pPr>
+              <w:spacing w:line="240" w:lineRule="auto"/>
+              <w:rPr>
+                <w:rFonts w:ascii="Courier New" w:eastAsia="Courier New" w:hAnsi="Courier New" w:cs="Courier New"/>
+                <w:sz w:val="20"/>
+                <w:szCs w:val="20"/>
+                <w:lang w:val="en-ID"/>
+              </w:rPr>
+            </w:pPr>
+            <w:r>
+              <w:rPr>
+                <w:rFonts w:ascii="Courier New" w:eastAsia="Courier New" w:hAnsi="Courier New" w:cs="Courier New"/>
+                <w:sz w:val="20"/>
+                <w:szCs w:val="20"/>
+                <w:lang w:val="en-ID"/>
+              </w:rPr>
+              <w:t>    "id_ref_key": "string",</w:t>
+            </w:r>
+          </w:p>
+          <w:p>
+            <w:pPr>
+              <w:spacing w:line="240" w:lineRule="auto"/>
+              <w:rPr>
+                <w:rFonts w:ascii="Courier New" w:eastAsia="Courier New" w:hAnsi="Courier New" w:cs="Courier New"/>
+                <w:sz w:val="20"/>
+                <w:szCs w:val="20"/>
+                <w:lang w:val="en-ID"/>
+              </w:rPr>
+            </w:pPr>
+            <w:r>
+              <w:rPr>
+                <w:rFonts w:ascii="Courier New" w:eastAsia="Courier New" w:hAnsi="Courier New" w:cs="Courier New"/>
+                <w:sz w:val="20"/>
+                <w:szCs w:val="20"/>
+                <w:lang w:val="en-ID"/>
+              </w:rPr>
+              <w:t>    "id_table": "string",</w:t>
+            </w:r>
+          </w:p>
+          <w:p>
+            <w:pPr>
+              <w:spacing w:line="240" w:lineRule="auto"/>
+              <w:rPr>
+                <w:rFonts w:ascii="Courier New" w:eastAsia="Courier New" w:hAnsi="Courier New" w:cs="Courier New"/>
+                <w:sz w:val="20"/>
+                <w:szCs w:val="20"/>
+                <w:lang w:val="en-ID"/>
+              </w:rPr>
+            </w:pPr>
+            <w:r>
+              <w:rPr>
+                <w:rFonts w:ascii="Courier New" w:eastAsia="Courier New" w:hAnsi="Courier New" w:cs="Courier New"/>
+                <w:sz w:val="20"/>
+                <w:szCs w:val="20"/>
+                <w:lang w:val="en-ID"/>
+              </w:rPr>
+              <w:t>    "kd_aktif": "string",</w:t>
+            </w:r>
+          </w:p>
+          <w:p>
+            <w:pPr>
+              <w:spacing w:line="240" w:lineRule="auto"/>
+              <w:rPr>
+                <w:rFonts w:ascii="Courier New" w:eastAsia="Courier New" w:hAnsi="Courier New" w:cs="Courier New"/>
+                <w:sz w:val="20"/>
+                <w:szCs w:val="20"/>
+                <w:lang w:val="en-ID"/>
+              </w:rPr>
+            </w:pPr>
+            <w:r>
+              <w:rPr>
+                <w:rFonts w:ascii="Courier New" w:eastAsia="Courier New" w:hAnsi="Courier New" w:cs="Courier New"/>
+                <w:sz w:val="20"/>
+                <w:szCs w:val="20"/>
+                <w:lang w:val="en-ID"/>
+              </w:rPr>
+              <w:t>    "ket_ref_data": "string",</w:t>
+            </w:r>
+          </w:p>
+          <w:p>
+            <w:pPr>
+              <w:spacing w:line="240" w:lineRule="auto"/>
+              <w:rPr>
+                <w:rFonts w:ascii="Courier New" w:eastAsia="Courier New" w:hAnsi="Courier New" w:cs="Courier New"/>
+                <w:sz w:val="20"/>
+                <w:szCs w:val="20"/>
+                <w:lang w:val="en-ID"/>
+              </w:rPr>
+            </w:pPr>
+            <w:r>
+              <w:rPr>
+                <w:rFonts w:ascii="Courier New" w:eastAsia="Courier New" w:hAnsi="Courier New" w:cs="Courier New"/>
+                <w:sz w:val="20"/>
+                <w:szCs w:val="20"/>
+                <w:lang w:val="en-ID"/>
+              </w:rPr>
+              <w:t>    "last_updated_by": "string",</w:t>
+            </w:r>
+          </w:p>
+          <w:p>
+            <w:pPr>
+              <w:spacing w:line="240" w:lineRule="auto"/>
+              <w:rPr>
+                <w:rFonts w:ascii="Courier New" w:eastAsia="Courier New" w:hAnsi="Courier New" w:cs="Courier New"/>
+                <w:sz w:val="20"/>
+                <w:szCs w:val="20"/>
+                <w:lang w:val="en-ID"/>
+              </w:rPr>
+            </w:pPr>
+            <w:r>
+              <w:rPr>
+                <w:rFonts w:ascii="Courier New" w:eastAsia="Courier New" w:hAnsi="Courier New" w:cs="Courier New"/>
+                <w:sz w:val="20"/>
+                <w:szCs w:val="20"/>
+                <w:lang w:val="en-ID"/>
+              </w:rPr>
+              <w:t>    "last_updated_date": "string",</w:t>
+            </w:r>
+          </w:p>
+          <w:p>
+            <w:pPr>
+              <w:spacing w:line="240" w:lineRule="auto"/>
+              <w:rPr>
+                <w:rFonts w:ascii="Courier New" w:eastAsia="Courier New" w:hAnsi="Courier New" w:cs="Courier New"/>
+                <w:sz w:val="20"/>
+                <w:szCs w:val="20"/>
+                <w:lang w:val="en-ID"/>
+              </w:rPr>
+            </w:pPr>
+            <w:r>
+              <w:rPr>
+                <w:rFonts w:ascii="Courier New" w:eastAsia="Courier New" w:hAnsi="Courier New" w:cs="Courier New"/>
+                <w:sz w:val="20"/>
+                <w:szCs w:val="20"/>
+                <w:lang w:val="en-ID"/>
+              </w:rPr>
+              <w:t>    "level_akses": "string",</w:t>
+            </w:r>
+          </w:p>
+          <w:p>
+            <w:pPr>
+              <w:spacing w:line="240" w:lineRule="auto"/>
+              <w:rPr>
+                <w:rFonts w:ascii="Courier New" w:eastAsia="Courier New" w:hAnsi="Courier New" w:cs="Courier New"/>
+                <w:sz w:val="20"/>
+                <w:szCs w:val="20"/>
+                <w:lang w:val="en-ID"/>
+              </w:rPr>
+            </w:pPr>
+            <w:r>
+              <w:rPr>
+                <w:rFonts w:ascii="Courier New" w:eastAsia="Courier New" w:hAnsi="Courier New" w:cs="Courier New"/>
+                <w:sz w:val="20"/>
+                <w:szCs w:val="20"/>
+                <w:lang w:val="en-ID"/>
+              </w:rPr>
+              <w:t>    "program_name": "string",</w:t>
+            </w:r>
+          </w:p>
+          <w:p>
+            <w:pPr>
+              <w:spacing w:line="240" w:lineRule="auto"/>
+              <w:rPr>
+                <w:rFonts w:ascii="Courier New" w:eastAsia="Courier New" w:hAnsi="Courier New" w:cs="Courier New"/>
+                <w:sz w:val="20"/>
+                <w:szCs w:val="20"/>
+                <w:lang w:val="en-ID"/>
+              </w:rPr>
+            </w:pPr>
+            <w:r>
+              <w:rPr>
+                <w:rFonts w:ascii="Courier New" w:eastAsia="Courier New" w:hAnsi="Courier New" w:cs="Courier New"/>
+                <w:sz w:val="20"/>
+                <w:szCs w:val="20"/>
+                <w:lang w:val="en-ID"/>
+              </w:rPr>
+              <w:t>    "rc": 0,</w:t>
+            </w:r>
+          </w:p>
+          <w:p>
+            <w:pPr>
+              <w:spacing w:line="240" w:lineRule="auto"/>
+              <w:rPr>
+                <w:rFonts w:ascii="Courier New" w:eastAsia="Courier New" w:hAnsi="Courier New" w:cs="Courier New"/>
+                <w:sz w:val="20"/>
+                <w:szCs w:val="20"/>
+                <w:lang w:val="en-ID"/>
+              </w:rPr>
+            </w:pPr>
+            <w:r>
+              <w:rPr>
+                <w:rFonts w:ascii="Courier New" w:eastAsia="Courier New" w:hAnsi="Courier New" w:cs="Courier New"/>
+                <w:sz w:val="20"/>
+                <w:szCs w:val="20"/>
+                <w:lang w:val="en-ID"/>
+              </w:rPr>
+              <w:t>    "ref1": "string",</w:t>
+            </w:r>
+          </w:p>
+          <w:p>
+            <w:pPr>
+              <w:spacing w:line="240" w:lineRule="auto"/>
+              <w:rPr>
+                <w:rFonts w:ascii="Courier New" w:eastAsia="Courier New" w:hAnsi="Courier New" w:cs="Courier New"/>
+                <w:sz w:val="20"/>
+                <w:szCs w:val="20"/>
+                <w:lang w:val="en-ID"/>
+              </w:rPr>
+            </w:pPr>
+            <w:r>
+              <w:rPr>
+                <w:rFonts w:ascii="Courier New" w:eastAsia="Courier New" w:hAnsi="Courier New" w:cs="Courier New"/>
+                <w:sz w:val="20"/>
+                <w:szCs w:val="20"/>
+                <w:lang w:val="en-ID"/>
+              </w:rPr>
+              <w:t>    "ref2": "string",</w:t>
+            </w:r>
+          </w:p>
+          <w:p>
+            <w:pPr>
+              <w:spacing w:line="240" w:lineRule="auto"/>
+              <w:rPr>
+                <w:rFonts w:ascii="Courier New" w:eastAsia="Courier New" w:hAnsi="Courier New" w:cs="Courier New"/>
+                <w:sz w:val="20"/>
+                <w:szCs w:val="20"/>
+                <w:lang w:val="en-ID"/>
+              </w:rPr>
+            </w:pPr>
+            <w:r>
+              <w:rPr>
+                <w:rFonts w:ascii="Courier New" w:eastAsia="Courier New" w:hAnsi="Courier New" w:cs="Courier New"/>
+                <w:sz w:val="20"/>
+                <w:szCs w:val="20"/>
+                <w:lang w:val="en-ID"/>
+              </w:rPr>
+              <w:t>    "ref3": "string",</w:t>
+            </w:r>
+          </w:p>
+          <w:p>
+            <w:pPr>
+              <w:spacing w:line="240" w:lineRule="auto"/>
+              <w:rPr>
+                <w:rFonts w:ascii="Courier New" w:eastAsia="Courier New" w:hAnsi="Courier New" w:cs="Courier New"/>
+                <w:sz w:val="20"/>
+                <w:szCs w:val="20"/>
+                <w:lang w:val="en-ID"/>
+              </w:rPr>
+            </w:pPr>
+            <w:r>
+              <w:rPr>
+                <w:rFonts w:ascii="Courier New" w:eastAsia="Courier New" w:hAnsi="Courier New" w:cs="Courier New"/>
+                <w:sz w:val="20"/>
+                <w:szCs w:val="20"/>
+                <w:lang w:val="en-ID"/>
+              </w:rPr>
+              <w:t>    "ref4": "string",</w:t>
+            </w:r>
+          </w:p>
+          <w:p>
+            <w:pPr>
+              <w:spacing w:line="240" w:lineRule="auto"/>
+              <w:rPr>
+                <w:rFonts w:ascii="Courier New" w:eastAsia="Courier New" w:hAnsi="Courier New" w:cs="Courier New"/>
+                <w:sz w:val="20"/>
+                <w:szCs w:val="20"/>
+                <w:lang w:val="en-ID"/>
+              </w:rPr>
+            </w:pPr>
+            <w:r>
+              <w:rPr>
+                <w:rFonts w:ascii="Courier New" w:eastAsia="Courier New" w:hAnsi="Courier New" w:cs="Courier New"/>
+                <w:sz w:val="20"/>
+                <w:szCs w:val="20"/>
+                <w:lang w:val="en-ID"/>
+              </w:rPr>
+              <w:t>    "ref5": "string",</w:t>
+            </w:r>
+          </w:p>
+          <w:p>
+            <w:pPr>
+              <w:spacing w:line="240" w:lineRule="auto"/>
+              <w:rPr>
+                <w:rFonts w:ascii="Courier New" w:eastAsia="Courier New" w:hAnsi="Courier New" w:cs="Courier New"/>
+                <w:sz w:val="20"/>
+                <w:szCs w:val="20"/>
+                <w:lang w:val="en-ID"/>
+              </w:rPr>
+            </w:pPr>
+            <w:r>
+              <w:rPr>
+                <w:rFonts w:ascii="Courier New" w:eastAsia="Courier New" w:hAnsi="Courier New" w:cs="Courier New"/>
+                <w:sz w:val="20"/>
+                <w:szCs w:val="20"/>
+                <w:lang w:val="en-ID"/>
+              </w:rPr>
+              <w:t>    "terminal_code": 0,</w:t>
+            </w:r>
+          </w:p>
+          <w:p>
+            <w:pPr>
+              <w:spacing w:line="240" w:lineRule="auto"/>
+              <w:rPr>
+                <w:rFonts w:ascii="Courier New" w:eastAsia="Courier New" w:hAnsi="Courier New" w:cs="Courier New"/>
+                <w:sz w:val="20"/>
+                <w:szCs w:val="20"/>
+                <w:lang w:val="en-ID"/>
+              </w:rPr>
+            </w:pPr>
+            <w:r>
+              <w:rPr>
+                <w:rFonts w:ascii="Courier New" w:eastAsia="Courier New" w:hAnsi="Courier New" w:cs="Courier New"/>
+                <w:sz w:val="20"/>
+                <w:szCs w:val="20"/>
+                <w:lang w:val="en-ID"/>
+              </w:rPr>
+              <w:t>    "val1": 0,</w:t>
+            </w:r>
+          </w:p>
+          <w:p>
+            <w:pPr>
+              <w:spacing w:line="240" w:lineRule="auto"/>
+              <w:rPr>
+                <w:rFonts w:ascii="Courier New" w:eastAsia="Courier New" w:hAnsi="Courier New" w:cs="Courier New"/>
+                <w:sz w:val="20"/>
+                <w:szCs w:val="20"/>
+                <w:lang w:val="en-ID"/>
+              </w:rPr>
+            </w:pPr>
+            <w:r>
+              <w:rPr>
+                <w:rFonts w:ascii="Courier New" w:eastAsia="Courier New" w:hAnsi="Courier New" w:cs="Courier New"/>
+                <w:sz w:val="20"/>
+                <w:szCs w:val="20"/>
+                <w:lang w:val="en-ID"/>
+              </w:rPr>
+              <w:t>    "val2": 0,</w:t>
+            </w:r>
+          </w:p>
+          <w:p>
+            <w:pPr>
+              <w:spacing w:line="240" w:lineRule="auto"/>
+              <w:rPr>
+                <w:rFonts w:ascii="Courier New" w:eastAsia="Courier New" w:hAnsi="Courier New" w:cs="Courier New"/>
+                <w:sz w:val="20"/>
+                <w:szCs w:val="20"/>
+                <w:lang w:val="en-ID"/>
+              </w:rPr>
+            </w:pPr>
+            <w:r>
+              <w:rPr>
+                <w:rFonts w:ascii="Courier New" w:eastAsia="Courier New" w:hAnsi="Courier New" w:cs="Courier New"/>
+                <w:sz w:val="20"/>
+                <w:szCs w:val="20"/>
+                <w:lang w:val="en-ID"/>
+              </w:rPr>
+              <w:t>    "val3": 0,</w:t>
+            </w:r>
+          </w:p>
+          <w:p>
+            <w:pPr>
+              <w:spacing w:line="240" w:lineRule="auto"/>
+              <w:rPr>
+                <w:rFonts w:ascii="Courier New" w:eastAsia="Courier New" w:hAnsi="Courier New" w:cs="Courier New"/>
+                <w:sz w:val="20"/>
+                <w:szCs w:val="20"/>
+                <w:lang w:val="en-ID"/>
+              </w:rPr>
+            </w:pPr>
+            <w:r>
+              <w:rPr>
+                <w:rFonts w:ascii="Courier New" w:eastAsia="Courier New" w:hAnsi="Courier New" w:cs="Courier New"/>
+                <w:sz w:val="20"/>
+                <w:szCs w:val="20"/>
+                <w:lang w:val="en-ID"/>
+              </w:rPr>
+              <w:t>    "val4": 0,</w:t>
+            </w:r>
+          </w:p>
+          <w:p>
+            <w:pPr>
+              <w:spacing w:line="240" w:lineRule="auto"/>
+              <w:rPr>
+                <w:rFonts w:ascii="Courier New" w:eastAsia="Courier New" w:hAnsi="Courier New" w:cs="Courier New"/>
+                <w:sz w:val="20"/>
+                <w:szCs w:val="20"/>
+                <w:lang w:val="en-ID"/>
+              </w:rPr>
+            </w:pPr>
+            <w:r>
+              <w:rPr>
+                <w:rFonts w:ascii="Courier New" w:eastAsia="Courier New" w:hAnsi="Courier New" w:cs="Courier New"/>
+                <w:sz w:val="20"/>
+                <w:szCs w:val="20"/>
+                <w:lang w:val="en-ID"/>
+              </w:rPr>
+              <w:t>    "val5": 0</w:t>
+            </w:r>
+          </w:p>
+          <w:p>
+            <w:pPr>
+              <w:spacing w:line="240" w:lineRule="auto"/>
+              <w:rPr>
+                <w:rFonts w:ascii="Courier New" w:eastAsia="Courier New" w:hAnsi="Courier New" w:cs="Courier New"/>
+                <w:sz w:val="20"/>
+                <w:szCs w:val="20"/>
+                <w:lang w:val="en-ID"/>
+              </w:rPr>
+            </w:pPr>
+            <w:r>
+              <w:rPr>
+                <w:rFonts w:ascii="Courier New" w:eastAsia="Courier New" w:hAnsi="Courier New" w:cs="Courier New"/>
+                <w:sz w:val="20"/>
+                <w:szCs w:val="20"/>
+                <w:lang w:val="en-ID"/>
+              </w:rPr>
+              <w:t>  }</w:t>
+            </w:r>
+          </w:p>
+          <w:p>
+            <w:pPr>
+              <w:spacing w:line="240" w:lineRule="auto"/>
+              <w:rPr>
+                <w:rFonts w:ascii="Courier New" w:eastAsia="Courier New" w:hAnsi="Courier New" w:cs="Courier New"/>
+                <w:sz w:val="20"/>
+                <w:szCs w:val="20"/>
+                <w:lang w:val="en-ID"/>
+              </w:rPr>
+            </w:pPr>
+            <w:r>
+              <w:rPr>
+                <w:rFonts w:ascii="Courier New" w:eastAsia="Courier New" w:hAnsi="Courier New" w:cs="Courier New"/>
+                <w:sz w:val="20"/>
+                <w:szCs w:val="20"/>
+                <w:lang w:val="en-ID"/>
+              </w:rPr>
+              <w:t>],</w:t>
             </w:r>
           </w:p>
           <w:p>
@@ -26563,7 +27283,407 @@
                 <w:szCs w:val="20"/>
                 <w:lang w:val="en-ID"/>
               </w:rPr>
-              <w:t>{}</w:t>
+              <w:t>[</w:t>
+            </w:r>
+          </w:p>
+          <w:p>
+            <w:pPr>
+              <w:spacing w:line="240" w:lineRule="auto"/>
+              <w:rPr>
+                <w:rFonts w:ascii="Courier New" w:eastAsia="Courier New" w:hAnsi="Courier New" w:cs="Courier New"/>
+                <w:sz w:val="20"/>
+                <w:szCs w:val="20"/>
+                <w:lang w:val="en-ID"/>
+              </w:rPr>
+            </w:pPr>
+            <w:r>
+              <w:rPr>
+                <w:rFonts w:ascii="Courier New" w:eastAsia="Courier New" w:hAnsi="Courier New" w:cs="Courier New"/>
+                <w:sz w:val="20"/>
+                <w:szCs w:val="20"/>
+                <w:lang w:val="en-ID"/>
+              </w:rPr>
+              <w:t>  {</w:t>
+            </w:r>
+          </w:p>
+          <w:p>
+            <w:pPr>
+              <w:spacing w:line="240" w:lineRule="auto"/>
+              <w:rPr>
+                <w:rFonts w:ascii="Courier New" w:eastAsia="Courier New" w:hAnsi="Courier New" w:cs="Courier New"/>
+                <w:sz w:val="20"/>
+                <w:szCs w:val="20"/>
+                <w:lang w:val="en-ID"/>
+              </w:rPr>
+            </w:pPr>
+            <w:r>
+              <w:rPr>
+                <w:rFonts w:ascii="Courier New" w:eastAsia="Courier New" w:hAnsi="Courier New" w:cs="Courier New"/>
+                <w:sz w:val="20"/>
+                <w:szCs w:val="20"/>
+                <w:lang w:val="en-ID"/>
+              </w:rPr>
+              <w:t>    "access_id": 0,</w:t>
+            </w:r>
+          </w:p>
+          <w:p>
+            <w:pPr>
+              <w:spacing w:line="240" w:lineRule="auto"/>
+              <w:rPr>
+                <w:rFonts w:ascii="Courier New" w:eastAsia="Courier New" w:hAnsi="Courier New" w:cs="Courier New"/>
+                <w:sz w:val="20"/>
+                <w:szCs w:val="20"/>
+                <w:lang w:val="en-ID"/>
+              </w:rPr>
+            </w:pPr>
+            <w:r>
+              <w:rPr>
+                <w:rFonts w:ascii="Courier New" w:eastAsia="Courier New" w:hAnsi="Courier New" w:cs="Courier New"/>
+                <w:sz w:val="20"/>
+                <w:szCs w:val="20"/>
+                <w:lang w:val="en-ID"/>
+              </w:rPr>
+              <w:t>    "application_id": 0,</w:t>
+            </w:r>
+          </w:p>
+          <w:p>
+            <w:pPr>
+              <w:spacing w:line="240" w:lineRule="auto"/>
+              <w:rPr>
+                <w:rFonts w:ascii="Courier New" w:eastAsia="Courier New" w:hAnsi="Courier New" w:cs="Courier New"/>
+                <w:sz w:val="20"/>
+                <w:szCs w:val="20"/>
+                <w:lang w:val="en-ID"/>
+              </w:rPr>
+            </w:pPr>
+            <w:r>
+              <w:rPr>
+                <w:rFonts w:ascii="Courier New" w:eastAsia="Courier New" w:hAnsi="Courier New" w:cs="Courier New"/>
+                <w:sz w:val="20"/>
+                <w:szCs w:val="20"/>
+                <w:lang w:val="en-ID"/>
+              </w:rPr>
+              <w:t>    "can_delete": 0,</w:t>
+            </w:r>
+          </w:p>
+          <w:p>
+            <w:pPr>
+              <w:spacing w:line="240" w:lineRule="auto"/>
+              <w:rPr>
+                <w:rFonts w:ascii="Courier New" w:eastAsia="Courier New" w:hAnsi="Courier New" w:cs="Courier New"/>
+                <w:sz w:val="20"/>
+                <w:szCs w:val="20"/>
+                <w:lang w:val="en-ID"/>
+              </w:rPr>
+            </w:pPr>
+            <w:r>
+              <w:rPr>
+                <w:rFonts w:ascii="Courier New" w:eastAsia="Courier New" w:hAnsi="Courier New" w:cs="Courier New"/>
+                <w:sz w:val="20"/>
+                <w:szCs w:val="20"/>
+                <w:lang w:val="en-ID"/>
+              </w:rPr>
+              <w:t>    "can_insert": 0,</w:t>
+            </w:r>
+          </w:p>
+          <w:p>
+            <w:pPr>
+              <w:spacing w:line="240" w:lineRule="auto"/>
+              <w:rPr>
+                <w:rFonts w:ascii="Courier New" w:eastAsia="Courier New" w:hAnsi="Courier New" w:cs="Courier New"/>
+                <w:sz w:val="20"/>
+                <w:szCs w:val="20"/>
+                <w:lang w:val="en-ID"/>
+              </w:rPr>
+            </w:pPr>
+            <w:r>
+              <w:rPr>
+                <w:rFonts w:ascii="Courier New" w:eastAsia="Courier New" w:hAnsi="Courier New" w:cs="Courier New"/>
+                <w:sz w:val="20"/>
+                <w:szCs w:val="20"/>
+                <w:lang w:val="en-ID"/>
+              </w:rPr>
+              <w:t>    "can_update": 0,</w:t>
+            </w:r>
+          </w:p>
+          <w:p>
+            <w:pPr>
+              <w:spacing w:line="240" w:lineRule="auto"/>
+              <w:rPr>
+                <w:rFonts w:ascii="Courier New" w:eastAsia="Courier New" w:hAnsi="Courier New" w:cs="Courier New"/>
+                <w:sz w:val="20"/>
+                <w:szCs w:val="20"/>
+                <w:lang w:val="en-ID"/>
+              </w:rPr>
+            </w:pPr>
+            <w:r>
+              <w:rPr>
+                <w:rFonts w:ascii="Courier New" w:eastAsia="Courier New" w:hAnsi="Courier New" w:cs="Courier New"/>
+                <w:sz w:val="20"/>
+                <w:szCs w:val="20"/>
+                <w:lang w:val="en-ID"/>
+              </w:rPr>
+              <w:t>    "creation_by": 0,</w:t>
+            </w:r>
+          </w:p>
+          <w:p>
+            <w:pPr>
+              <w:spacing w:line="240" w:lineRule="auto"/>
+              <w:rPr>
+                <w:rFonts w:ascii="Courier New" w:eastAsia="Courier New" w:hAnsi="Courier New" w:cs="Courier New"/>
+                <w:sz w:val="20"/>
+                <w:szCs w:val="20"/>
+                <w:lang w:val="en-ID"/>
+              </w:rPr>
+            </w:pPr>
+            <w:r>
+              <w:rPr>
+                <w:rFonts w:ascii="Courier New" w:eastAsia="Courier New" w:hAnsi="Courier New" w:cs="Courier New"/>
+                <w:sz w:val="20"/>
+                <w:szCs w:val="20"/>
+                <w:lang w:val="en-ID"/>
+              </w:rPr>
+              <w:t>    "creation_date": "string",</w:t>
+            </w:r>
+          </w:p>
+          <w:p>
+            <w:pPr>
+              <w:spacing w:line="240" w:lineRule="auto"/>
+              <w:rPr>
+                <w:rFonts w:ascii="Courier New" w:eastAsia="Courier New" w:hAnsi="Courier New" w:cs="Courier New"/>
+                <w:sz w:val="20"/>
+                <w:szCs w:val="20"/>
+                <w:lang w:val="en-ID"/>
+              </w:rPr>
+            </w:pPr>
+            <w:r>
+              <w:rPr>
+                <w:rFonts w:ascii="Courier New" w:eastAsia="Courier New" w:hAnsi="Courier New" w:cs="Courier New"/>
+                <w:sz w:val="20"/>
+                <w:szCs w:val="20"/>
+                <w:lang w:val="en-ID"/>
+              </w:rPr>
+              <w:t>    "last_update_by": 0,</w:t>
+            </w:r>
+          </w:p>
+          <w:p>
+            <w:pPr>
+              <w:spacing w:line="240" w:lineRule="auto"/>
+              <w:rPr>
+                <w:rFonts w:ascii="Courier New" w:eastAsia="Courier New" w:hAnsi="Courier New" w:cs="Courier New"/>
+                <w:sz w:val="20"/>
+                <w:szCs w:val="20"/>
+                <w:lang w:val="en-ID"/>
+              </w:rPr>
+            </w:pPr>
+            <w:r>
+              <w:rPr>
+                <w:rFonts w:ascii="Courier New" w:eastAsia="Courier New" w:hAnsi="Courier New" w:cs="Courier New"/>
+                <w:sz w:val="20"/>
+                <w:szCs w:val="20"/>
+                <w:lang w:val="en-ID"/>
+              </w:rPr>
+              <w:t>    "last_update_date": "string",</w:t>
+            </w:r>
+          </w:p>
+          <w:p>
+            <w:pPr>
+              <w:spacing w:line="240" w:lineRule="auto"/>
+              <w:rPr>
+                <w:rFonts w:ascii="Courier New" w:eastAsia="Courier New" w:hAnsi="Courier New" w:cs="Courier New"/>
+                <w:sz w:val="20"/>
+                <w:szCs w:val="20"/>
+                <w:lang w:val="en-ID"/>
+              </w:rPr>
+            </w:pPr>
+            <w:r>
+              <w:rPr>
+                <w:rFonts w:ascii="Courier New" w:eastAsia="Courier New" w:hAnsi="Courier New" w:cs="Courier New"/>
+                <w:sz w:val="20"/>
+                <w:szCs w:val="20"/>
+                <w:lang w:val="en-ID"/>
+              </w:rPr>
+              <w:t>    "menu_icon": "string",</w:t>
+            </w:r>
+          </w:p>
+          <w:p>
+            <w:pPr>
+              <w:spacing w:line="240" w:lineRule="auto"/>
+              <w:rPr>
+                <w:rFonts w:ascii="Courier New" w:eastAsia="Courier New" w:hAnsi="Courier New" w:cs="Courier New"/>
+                <w:sz w:val="20"/>
+                <w:szCs w:val="20"/>
+                <w:lang w:val="en-ID"/>
+              </w:rPr>
+            </w:pPr>
+            <w:r>
+              <w:rPr>
+                <w:rFonts w:ascii="Courier New" w:eastAsia="Courier New" w:hAnsi="Courier New" w:cs="Courier New"/>
+                <w:sz w:val="20"/>
+                <w:szCs w:val="20"/>
+                <w:lang w:val="en-ID"/>
+              </w:rPr>
+              <w:t>    "menu_id": 0,</w:t>
+            </w:r>
+          </w:p>
+          <w:p>
+            <w:pPr>
+              <w:spacing w:line="240" w:lineRule="auto"/>
+              <w:rPr>
+                <w:rFonts w:ascii="Courier New" w:eastAsia="Courier New" w:hAnsi="Courier New" w:cs="Courier New"/>
+                <w:sz w:val="20"/>
+                <w:szCs w:val="20"/>
+                <w:lang w:val="en-ID"/>
+              </w:rPr>
+            </w:pPr>
+            <w:r>
+              <w:rPr>
+                <w:rFonts w:ascii="Courier New" w:eastAsia="Courier New" w:hAnsi="Courier New" w:cs="Courier New"/>
+                <w:sz w:val="20"/>
+                <w:szCs w:val="20"/>
+                <w:lang w:val="en-ID"/>
+              </w:rPr>
+              <w:t>    "menu_order": 0,</w:t>
+            </w:r>
+          </w:p>
+          <w:p>
+            <w:pPr>
+              <w:spacing w:line="240" w:lineRule="auto"/>
+              <w:rPr>
+                <w:rFonts w:ascii="Courier New" w:eastAsia="Courier New" w:hAnsi="Courier New" w:cs="Courier New"/>
+                <w:sz w:val="20"/>
+                <w:szCs w:val="20"/>
+                <w:lang w:val="en-ID"/>
+              </w:rPr>
+            </w:pPr>
+            <w:r>
+              <w:rPr>
+                <w:rFonts w:ascii="Courier New" w:eastAsia="Courier New" w:hAnsi="Courier New" w:cs="Courier New"/>
+                <w:sz w:val="20"/>
+                <w:szCs w:val="20"/>
+                <w:lang w:val="en-ID"/>
+              </w:rPr>
+              <w:t>    "menu_text": "string",</w:t>
+            </w:r>
+          </w:p>
+          <w:p>
+            <w:pPr>
+              <w:spacing w:line="240" w:lineRule="auto"/>
+              <w:rPr>
+                <w:rFonts w:ascii="Courier New" w:eastAsia="Courier New" w:hAnsi="Courier New" w:cs="Courier New"/>
+                <w:sz w:val="20"/>
+                <w:szCs w:val="20"/>
+                <w:lang w:val="en-ID"/>
+              </w:rPr>
+            </w:pPr>
+            <w:r>
+              <w:rPr>
+                <w:rFonts w:ascii="Courier New" w:eastAsia="Courier New" w:hAnsi="Courier New" w:cs="Courier New"/>
+                <w:sz w:val="20"/>
+                <w:szCs w:val="20"/>
+                <w:lang w:val="en-ID"/>
+              </w:rPr>
+              <w:t>    "menu_url": "string",</w:t>
+            </w:r>
+          </w:p>
+          <w:p>
+            <w:pPr>
+              <w:spacing w:line="240" w:lineRule="auto"/>
+              <w:rPr>
+                <w:rFonts w:ascii="Courier New" w:eastAsia="Courier New" w:hAnsi="Courier New" w:cs="Courier New"/>
+                <w:sz w:val="20"/>
+                <w:szCs w:val="20"/>
+                <w:lang w:val="en-ID"/>
+              </w:rPr>
+            </w:pPr>
+            <w:r>
+              <w:rPr>
+                <w:rFonts w:ascii="Courier New" w:eastAsia="Courier New" w:hAnsi="Courier New" w:cs="Courier New"/>
+                <w:sz w:val="20"/>
+                <w:szCs w:val="20"/>
+                <w:lang w:val="en-ID"/>
+              </w:rPr>
+              <w:t>    "parent_menu_id": 0,</w:t>
+            </w:r>
+          </w:p>
+          <w:p>
+            <w:pPr>
+              <w:spacing w:line="240" w:lineRule="auto"/>
+              <w:rPr>
+                <w:rFonts w:ascii="Courier New" w:eastAsia="Courier New" w:hAnsi="Courier New" w:cs="Courier New"/>
+                <w:sz w:val="20"/>
+                <w:szCs w:val="20"/>
+                <w:lang w:val="en-ID"/>
+              </w:rPr>
+            </w:pPr>
+            <w:r>
+              <w:rPr>
+                <w:rFonts w:ascii="Courier New" w:eastAsia="Courier New" w:hAnsi="Courier New" w:cs="Courier New"/>
+                <w:sz w:val="20"/>
+                <w:szCs w:val="20"/>
+                <w:lang w:val="en-ID"/>
+              </w:rPr>
+              <w:t>    "roles_id": 0,</w:t>
+            </w:r>
+          </w:p>
+          <w:p>
+            <w:pPr>
+              <w:spacing w:line="240" w:lineRule="auto"/>
+              <w:rPr>
+                <w:rFonts w:ascii="Courier New" w:eastAsia="Courier New" w:hAnsi="Courier New" w:cs="Courier New"/>
+                <w:sz w:val="20"/>
+                <w:szCs w:val="20"/>
+                <w:lang w:val="en-ID"/>
+              </w:rPr>
+            </w:pPr>
+            <w:r>
+              <w:rPr>
+                <w:rFonts w:ascii="Courier New" w:eastAsia="Courier New" w:hAnsi="Courier New" w:cs="Courier New"/>
+                <w:sz w:val="20"/>
+                <w:szCs w:val="20"/>
+                <w:lang w:val="en-ID"/>
+              </w:rPr>
+              <w:t>    "status": 0</w:t>
+            </w:r>
+          </w:p>
+          <w:p>
+            <w:pPr>
+              <w:spacing w:line="240" w:lineRule="auto"/>
+              <w:rPr>
+                <w:rFonts w:ascii="Courier New" w:eastAsia="Courier New" w:hAnsi="Courier New" w:cs="Courier New"/>
+                <w:sz w:val="20"/>
+                <w:szCs w:val="20"/>
+                <w:lang w:val="en-ID"/>
+              </w:rPr>
+            </w:pPr>
+            <w:r>
+              <w:rPr>
+                <w:rFonts w:ascii="Courier New" w:eastAsia="Courier New" w:hAnsi="Courier New" w:cs="Courier New"/>
+                <w:sz w:val="20"/>
+                <w:szCs w:val="20"/>
+                <w:lang w:val="en-ID"/>
+              </w:rPr>
+              <w:t>  }</w:t>
+            </w:r>
+          </w:p>
+          <w:p>
+            <w:pPr>
+              <w:spacing w:line="240" w:lineRule="auto"/>
+              <w:rPr>
+                <w:rFonts w:ascii="Courier New" w:eastAsia="Courier New" w:hAnsi="Courier New" w:cs="Courier New"/>
+                <w:sz w:val="20"/>
+                <w:szCs w:val="20"/>
+                <w:lang w:val="en-ID"/>
+              </w:rPr>
+            </w:pPr>
+            <w:r>
+              <w:rPr>
+                <w:rFonts w:ascii="Courier New" w:eastAsia="Courier New" w:hAnsi="Courier New" w:cs="Courier New"/>
+                <w:sz w:val="20"/>
+                <w:szCs w:val="20"/>
+                <w:lang w:val="en-ID"/>
+              </w:rPr>
+              <w:t>]</w:t>
             </w:r>
           </w:p>
         </w:tc>

</xml_diff>